<commit_message>
update VPC design document with latest changes
</commit_message>
<xml_diff>
--- a/VPC DESIGN DOCUMENT.docx
+++ b/VPC DESIGN DOCUMENT.docx
@@ -2381,15 +2381,10 @@
         <w:rPr>
           <w:rStyle w:val="StrongEmphasis"/>
           <w:b/>
+          <w:sz w:val="24"/>
+          <w:szCs w:val="24"/>
         </w:rPr>
         <w:t xml:space="preserve">Components Involved: </w:t>
-      </w:r>
-      <w:r>
-        <w:rPr>
-          <w:b w:val="false"/>
-          <w:bCs w:val="false"/>
-        </w:rPr>
-        <w:t>Internet,</w:t>
       </w:r>
       <w:r>
         <w:rPr>
@@ -2398,43 +2393,7 @@
           <w:sz w:val="24"/>
           <w:szCs w:val="24"/>
         </w:rPr>
-        <w:t xml:space="preserve"> Internet Gateway,  Public Subnet, Load Balancer, Web Server.</w:t>
-      </w:r>
-    </w:p>
-    <w:p>
-      <w:pPr>
-        <w:pStyle w:val="TextBody"/>
-        <w:numPr>
-          <w:ilvl w:val="0"/>
-          <w:numId w:val="7"/>
-        </w:numPr>
-        <w:pBdr/>
-        <w:tabs>
-          <w:tab w:val="clear" w:pos="709"/>
-          <w:tab w:val="left" w:pos="0" w:leader="none"/>
-        </w:tabs>
-        <w:bidi w:val="0"/>
-        <w:spacing w:lineRule="auto" w:line="288" w:before="0" w:after="80"/>
-        <w:ind w:left="709" w:hanging="283"/>
-        <w:rPr>
-          <w:color w:val="333333"/>
-          <w:shd w:fill="auto" w:val="clear"/>
-        </w:rPr>
-      </w:pPr>
-      <w:r>
-        <w:rPr>
-          <w:rFonts w:ascii="Arial;sans-serif" w:hAnsi="Arial;sans-serif"/>
-          <w:b w:val="false"/>
-          <w:i w:val="false"/>
-          <w:caps w:val="false"/>
-          <w:smallCaps w:val="false"/>
-          <w:strike w:val="false"/>
-          <w:dstrike w:val="false"/>
-          <w:color w:val="000000"/>
-          <w:sz w:val="22"/>
-          <w:u w:val="none"/>
-          <w:effect w:val="none"/>
-        </w:rPr>
+        <w:t>Internet, Internet Gateway,  Load Balancer, Public Subnet, Web Server.</w:t>
       </w:r>
     </w:p>
     <w:p>
@@ -2549,13 +2508,115 @@
         <w:pStyle w:val="TextBody"/>
         <w:numPr>
           <w:ilvl w:val="0"/>
+          <w:numId w:val="9"/>
+        </w:numPr>
+        <w:tabs>
+          <w:tab w:val="clear" w:pos="709"/>
+          <w:tab w:val="left" w:pos="0" w:leader="none"/>
+        </w:tabs>
+        <w:spacing w:before="0" w:after="0"/>
+        <w:ind w:left="709" w:hanging="283"/>
+        <w:rPr/>
+      </w:pPr>
+      <w:r>
+        <w:rPr/>
+        <w:t xml:space="preserve">DevOps engineer initiates SSH connection </w:t>
+      </w:r>
+    </w:p>
+    <w:p>
+      <w:pPr>
+        <w:pStyle w:val="TextBody"/>
+        <w:numPr>
+          <w:ilvl w:val="0"/>
+          <w:numId w:val="9"/>
+        </w:numPr>
+        <w:tabs>
+          <w:tab w:val="clear" w:pos="709"/>
+          <w:tab w:val="left" w:pos="0" w:leader="none"/>
+        </w:tabs>
+        <w:spacing w:before="0" w:after="0"/>
+        <w:ind w:left="709" w:hanging="283"/>
+        <w:rPr/>
+      </w:pPr>
+      <w:r>
+        <w:rPr/>
+        <w:t xml:space="preserve">Connects to: Bastion Host (Public subnet) via Internet Gateway </w:t>
+      </w:r>
+    </w:p>
+    <w:p>
+      <w:pPr>
+        <w:pStyle w:val="TextBody"/>
+        <w:numPr>
+          <w:ilvl w:val="0"/>
+          <w:numId w:val="9"/>
+        </w:numPr>
+        <w:tabs>
+          <w:tab w:val="clear" w:pos="709"/>
+          <w:tab w:val="left" w:pos="0" w:leader="none"/>
+        </w:tabs>
+        <w:spacing w:before="0" w:after="0"/>
+        <w:ind w:left="709" w:hanging="283"/>
+        <w:rPr/>
+      </w:pPr>
+      <w:r>
+        <w:rPr/>
+        <w:t xml:space="preserve">From Bastion Host: SSH into backend server (App subnet) </w:t>
+      </w:r>
+    </w:p>
+    <w:p>
+      <w:pPr>
+        <w:pStyle w:val="TextBody"/>
+        <w:numPr>
+          <w:ilvl w:val="0"/>
+          <w:numId w:val="9"/>
+        </w:numPr>
+        <w:tabs>
+          <w:tab w:val="clear" w:pos="709"/>
+          <w:tab w:val="left" w:pos="0" w:leader="none"/>
+        </w:tabs>
+        <w:ind w:left="709" w:hanging="283"/>
+        <w:rPr/>
+      </w:pPr>
+      <w:r>
+        <w:rPr/>
+        <w:t>Checks logs</w:t>
+      </w:r>
+    </w:p>
+    <w:p>
+      <w:pPr>
+        <w:pStyle w:val="Heading3"/>
+        <w:rPr/>
+      </w:pPr>
+      <w:r>
+        <w:rPr>
+          <w:rStyle w:val="StrongEmphasis"/>
+          <w:b/>
+          <w:sz w:val="24"/>
+          <w:szCs w:val="24"/>
+        </w:rPr>
+        <w:t xml:space="preserve">Components Involved: </w:t>
+      </w:r>
+      <w:r>
+        <w:rPr>
+          <w:b w:val="false"/>
+          <w:bCs w:val="false"/>
+          <w:sz w:val="24"/>
+          <w:szCs w:val="24"/>
+        </w:rPr>
+        <w:t>Internet,Internet Gateway, Bastion Host, Private App Server</w:t>
+      </w:r>
+    </w:p>
+    <w:p>
+      <w:pPr>
+        <w:pStyle w:val="TextBody"/>
+        <w:numPr>
+          <w:ilvl w:val="0"/>
           <w:numId w:val="7"/>
         </w:numPr>
         <w:tabs>
           <w:tab w:val="clear" w:pos="709"/>
           <w:tab w:val="left" w:pos="0" w:leader="none"/>
         </w:tabs>
-        <w:spacing w:before="0" w:after="140"/>
         <w:ind w:left="709" w:hanging="283"/>
         <w:rPr/>
       </w:pPr>
@@ -2606,6 +2667,224 @@
           <w:shd w:fill="auto" w:val="clear"/>
         </w:rPr>
         <w:t>How does the outbound traffic flow?</w:t>
+      </w:r>
+    </w:p>
+    <w:p>
+      <w:pPr>
+        <w:pStyle w:val="TextBody"/>
+        <w:numPr>
+          <w:ilvl w:val="0"/>
+          <w:numId w:val="0"/>
+        </w:numPr>
+        <w:ind w:hanging="0"/>
+        <w:rPr/>
+      </w:pPr>
+      <w:r>
+        <w:rPr>
+          <w:rFonts w:ascii="Arial;sans-serif" w:hAnsi="Arial;sans-serif"/>
+          <w:b w:val="false"/>
+          <w:i w:val="false"/>
+          <w:caps w:val="false"/>
+          <w:smallCaps w:val="false"/>
+          <w:strike w:val="false"/>
+          <w:dstrike w:val="false"/>
+          <w:color w:val="333333"/>
+          <w:sz w:val="22"/>
+          <w:u w:val="single"/>
+          <w:effect w:val="none"/>
+          <w:shd w:fill="auto" w:val="clear"/>
+        </w:rPr>
+        <w:t>Answer</w:t>
+      </w:r>
+      <w:r>
+        <w:rPr>
+          <w:rFonts w:ascii="Arial;sans-serif" w:hAnsi="Arial;sans-serif"/>
+          <w:b w:val="false"/>
+          <w:i w:val="false"/>
+          <w:caps w:val="false"/>
+          <w:smallCaps w:val="false"/>
+          <w:strike w:val="false"/>
+          <w:dstrike w:val="false"/>
+          <w:color w:val="333333"/>
+          <w:sz w:val="22"/>
+          <w:u w:val="none"/>
+          <w:effect w:val="none"/>
+          <w:shd w:fill="auto" w:val="clear"/>
+        </w:rPr>
+        <w:t>:</w:t>
+      </w:r>
+    </w:p>
+    <w:p>
+      <w:pPr>
+        <w:pStyle w:val="TextBody"/>
+        <w:numPr>
+          <w:ilvl w:val="0"/>
+          <w:numId w:val="0"/>
+        </w:numPr>
+        <w:ind w:hanging="0"/>
+        <w:rPr/>
+      </w:pPr>
+      <w:r>
+        <w:rPr>
+          <w:rFonts w:ascii="Arial;sans-serif" w:hAnsi="Arial;sans-serif"/>
+          <w:b w:val="false"/>
+          <w:i w:val="false"/>
+          <w:caps w:val="false"/>
+          <w:smallCaps w:val="false"/>
+          <w:strike w:val="false"/>
+          <w:dstrike w:val="false"/>
+          <w:color w:val="333333"/>
+          <w:sz w:val="22"/>
+          <w:u w:val="none"/>
+          <w:effect w:val="none"/>
+          <w:shd w:fill="auto" w:val="clear"/>
+        </w:rPr>
+        <w:t xml:space="preserve">- </w:t>
+      </w:r>
+      <w:r>
+        <w:rPr/>
+        <w:t xml:space="preserve">Backend server (App subnet) initiates request </w:t>
+      </w:r>
+    </w:p>
+    <w:p>
+      <w:pPr>
+        <w:pStyle w:val="TextBody"/>
+        <w:numPr>
+          <w:ilvl w:val="0"/>
+          <w:numId w:val="0"/>
+        </w:numPr>
+        <w:ind w:hanging="0"/>
+        <w:rPr/>
+      </w:pPr>
+      <w:r>
+        <w:rPr/>
+        <w:t xml:space="preserve">- Traffic routed via App Route Table </w:t>
+      </w:r>
+    </w:p>
+    <w:p>
+      <w:pPr>
+        <w:pStyle w:val="TextBody"/>
+        <w:numPr>
+          <w:ilvl w:val="0"/>
+          <w:numId w:val="0"/>
+        </w:numPr>
+        <w:ind w:hanging="0"/>
+        <w:rPr/>
+      </w:pPr>
+      <w:r>
+        <w:rPr/>
+        <w:t xml:space="preserve">- Sent to NAT Gateway (Public subnet) </w:t>
+      </w:r>
+    </w:p>
+    <w:p>
+      <w:pPr>
+        <w:pStyle w:val="TextBody"/>
+        <w:numPr>
+          <w:ilvl w:val="0"/>
+          <w:numId w:val="0"/>
+        </w:numPr>
+        <w:ind w:hanging="0"/>
+        <w:rPr/>
+      </w:pPr>
+      <w:r>
+        <w:rPr/>
+        <w:t>- NAT forwards traffic to Internet Gateway</w:t>
+      </w:r>
+    </w:p>
+    <w:p>
+      <w:pPr>
+        <w:pStyle w:val="TextBody"/>
+        <w:numPr>
+          <w:ilvl w:val="0"/>
+          <w:numId w:val="0"/>
+        </w:numPr>
+        <w:ind w:hanging="0"/>
+        <w:rPr/>
+      </w:pPr>
+      <w:r>
+        <w:rPr/>
+        <w:t xml:space="preserve">- Request reaches </w:t>
+      </w:r>
+      <w:r>
+        <w:rPr/>
+        <w:t>e</w:t>
+      </w:r>
+      <w:r>
+        <w:rPr/>
+        <w:t xml:space="preserve">xternal API (Paystack) </w:t>
+      </w:r>
+    </w:p>
+    <w:p>
+      <w:pPr>
+        <w:pStyle w:val="TextBody"/>
+        <w:numPr>
+          <w:ilvl w:val="0"/>
+          <w:numId w:val="0"/>
+        </w:numPr>
+        <w:ind w:hanging="0"/>
+        <w:rPr/>
+      </w:pPr>
+      <w:r>
+        <w:rPr/>
+        <w:t xml:space="preserve">- Response returns via: </w:t>
+      </w:r>
+    </w:p>
+    <w:p>
+      <w:pPr>
+        <w:pStyle w:val="TextBody"/>
+        <w:numPr>
+          <w:ilvl w:val="1"/>
+          <w:numId w:val="11"/>
+        </w:numPr>
+        <w:tabs>
+          <w:tab w:val="clear" w:pos="709"/>
+          <w:tab w:val="left" w:pos="0" w:leader="none"/>
+        </w:tabs>
+        <w:ind w:left="1418" w:hanging="283"/>
+        <w:rPr/>
+      </w:pPr>
+      <w:r>
+        <w:rPr/>
+        <w:t xml:space="preserve">Internet Gateway → NAT Gateway → App Server </w:t>
+      </w:r>
+    </w:p>
+    <w:p>
+      <w:pPr>
+        <w:pStyle w:val="Heading3"/>
+        <w:spacing w:before="140" w:after="120"/>
+        <w:rPr>
+          <w:rFonts w:ascii="Arial;sans-serif" w:hAnsi="Arial;sans-serif"/>
+          <w:b w:val="false"/>
+          <w:i w:val="false"/>
+          <w:caps w:val="false"/>
+          <w:smallCaps w:val="false"/>
+          <w:strike w:val="false"/>
+          <w:dstrike w:val="false"/>
+          <w:color w:val="333333"/>
+          <w:sz w:val="22"/>
+          <w:u w:val="none"/>
+          <w:effect w:val="none"/>
+          <w:shd w:fill="auto" w:val="clear"/>
+        </w:rPr>
+      </w:pPr>
+      <w:r>
+        <w:rPr>
+          <w:rStyle w:val="StrongEmphasis"/>
+          <w:b w:val="false"/>
+          <w:bCs w:val="false"/>
+          <w:sz w:val="24"/>
+          <w:szCs w:val="24"/>
+        </w:rPr>
+        <w:t xml:space="preserve">Components Involved: </w:t>
+      </w:r>
+      <w:r>
+        <w:rPr>
+          <w:b w:val="false"/>
+          <w:bCs w:val="false"/>
+          <w:sz w:val="24"/>
+          <w:szCs w:val="24"/>
+        </w:rPr>
+        <w:t>Private App Server, Route Table, NAT Gateway, Internet Gateway, External API</w:t>
       </w:r>
     </w:p>
     <w:sectPr>
@@ -3551,6 +3830,276 @@
     </w:lvl>
   </w:abstractNum>
   <w:abstractNum w:abstractNumId="8">
+    <w:lvl w:ilvl="0">
+      <w:start w:val="1"/>
+      <w:numFmt w:val="decimal"/>
+      <w:lvlText w:val="%1."/>
+      <w:lvlJc w:val="left"/>
+      <w:pPr>
+        <w:tabs>
+          <w:tab w:val="num" w:pos="709"/>
+        </w:tabs>
+        <w:ind w:left="709" w:hanging="283"/>
+      </w:pPr>
+      <w:rPr/>
+    </w:lvl>
+    <w:lvl w:ilvl="1">
+      <w:start w:val="1"/>
+      <w:numFmt w:val="bullet"/>
+      <w:lvlText w:val=""/>
+      <w:lvlJc w:val="left"/>
+      <w:pPr>
+        <w:tabs>
+          <w:tab w:val="num" w:pos="1418"/>
+        </w:tabs>
+        <w:ind w:left="1418" w:hanging="283"/>
+      </w:pPr>
+      <w:rPr>
+        <w:rFonts w:ascii="Symbol" w:hAnsi="Symbol" w:cs="Symbol" w:hint="default"/>
+      </w:rPr>
+    </w:lvl>
+    <w:lvl w:ilvl="2">
+      <w:start w:val="1"/>
+      <w:numFmt w:val="bullet"/>
+      <w:lvlText w:val=""/>
+      <w:lvlJc w:val="left"/>
+      <w:pPr>
+        <w:tabs>
+          <w:tab w:val="num" w:pos="2127"/>
+        </w:tabs>
+        <w:ind w:left="2127" w:hanging="283"/>
+      </w:pPr>
+      <w:rPr>
+        <w:rFonts w:ascii="Symbol" w:hAnsi="Symbol" w:cs="Symbol" w:hint="default"/>
+      </w:rPr>
+    </w:lvl>
+    <w:lvl w:ilvl="3">
+      <w:start w:val="1"/>
+      <w:numFmt w:val="bullet"/>
+      <w:lvlText w:val=""/>
+      <w:lvlJc w:val="left"/>
+      <w:pPr>
+        <w:tabs>
+          <w:tab w:val="num" w:pos="2836"/>
+        </w:tabs>
+        <w:ind w:left="2836" w:hanging="283"/>
+      </w:pPr>
+      <w:rPr>
+        <w:rFonts w:ascii="Symbol" w:hAnsi="Symbol" w:cs="Symbol" w:hint="default"/>
+      </w:rPr>
+    </w:lvl>
+    <w:lvl w:ilvl="4">
+      <w:start w:val="1"/>
+      <w:numFmt w:val="bullet"/>
+      <w:lvlText w:val=""/>
+      <w:lvlJc w:val="left"/>
+      <w:pPr>
+        <w:tabs>
+          <w:tab w:val="num" w:pos="3545"/>
+        </w:tabs>
+        <w:ind w:left="3545" w:hanging="283"/>
+      </w:pPr>
+      <w:rPr>
+        <w:rFonts w:ascii="Symbol" w:hAnsi="Symbol" w:cs="Symbol" w:hint="default"/>
+      </w:rPr>
+    </w:lvl>
+    <w:lvl w:ilvl="5">
+      <w:start w:val="1"/>
+      <w:numFmt w:val="bullet"/>
+      <w:lvlText w:val=""/>
+      <w:lvlJc w:val="left"/>
+      <w:pPr>
+        <w:tabs>
+          <w:tab w:val="num" w:pos="4254"/>
+        </w:tabs>
+        <w:ind w:left="4254" w:hanging="283"/>
+      </w:pPr>
+      <w:rPr>
+        <w:rFonts w:ascii="Symbol" w:hAnsi="Symbol" w:cs="Symbol" w:hint="default"/>
+      </w:rPr>
+    </w:lvl>
+    <w:lvl w:ilvl="6">
+      <w:start w:val="1"/>
+      <w:numFmt w:val="bullet"/>
+      <w:lvlText w:val=""/>
+      <w:lvlJc w:val="left"/>
+      <w:pPr>
+        <w:tabs>
+          <w:tab w:val="num" w:pos="4963"/>
+        </w:tabs>
+        <w:ind w:left="4963" w:hanging="283"/>
+      </w:pPr>
+      <w:rPr>
+        <w:rFonts w:ascii="Symbol" w:hAnsi="Symbol" w:cs="Symbol" w:hint="default"/>
+      </w:rPr>
+    </w:lvl>
+    <w:lvl w:ilvl="7">
+      <w:start w:val="1"/>
+      <w:numFmt w:val="bullet"/>
+      <w:lvlText w:val=""/>
+      <w:lvlJc w:val="left"/>
+      <w:pPr>
+        <w:tabs>
+          <w:tab w:val="num" w:pos="5672"/>
+        </w:tabs>
+        <w:ind w:left="5672" w:hanging="283"/>
+      </w:pPr>
+      <w:rPr>
+        <w:rFonts w:ascii="Symbol" w:hAnsi="Symbol" w:cs="Symbol" w:hint="default"/>
+      </w:rPr>
+    </w:lvl>
+    <w:lvl w:ilvl="8">
+      <w:start w:val="1"/>
+      <w:numFmt w:val="bullet"/>
+      <w:lvlText w:val=""/>
+      <w:lvlJc w:val="left"/>
+      <w:pPr>
+        <w:tabs>
+          <w:tab w:val="num" w:pos="6381"/>
+        </w:tabs>
+        <w:ind w:left="6381" w:hanging="283"/>
+      </w:pPr>
+      <w:rPr>
+        <w:rFonts w:ascii="Symbol" w:hAnsi="Symbol" w:cs="Symbol" w:hint="default"/>
+      </w:rPr>
+    </w:lvl>
+  </w:abstractNum>
+  <w:abstractNum w:abstractNumId="9">
+    <w:lvl w:ilvl="0">
+      <w:start w:val="1"/>
+      <w:numFmt w:val="decimal"/>
+      <w:lvlText w:val="%1."/>
+      <w:lvlJc w:val="left"/>
+      <w:pPr>
+        <w:tabs>
+          <w:tab w:val="num" w:pos="709"/>
+        </w:tabs>
+        <w:ind w:left="709" w:hanging="283"/>
+      </w:pPr>
+      <w:rPr/>
+    </w:lvl>
+    <w:lvl w:ilvl="1">
+      <w:start w:val="1"/>
+      <w:numFmt w:val="bullet"/>
+      <w:lvlText w:val=""/>
+      <w:lvlJc w:val="left"/>
+      <w:pPr>
+        <w:tabs>
+          <w:tab w:val="num" w:pos="1418"/>
+        </w:tabs>
+        <w:ind w:left="1418" w:hanging="283"/>
+      </w:pPr>
+      <w:rPr>
+        <w:rFonts w:ascii="Symbol" w:hAnsi="Symbol" w:cs="Symbol" w:hint="default"/>
+      </w:rPr>
+    </w:lvl>
+    <w:lvl w:ilvl="2">
+      <w:start w:val="1"/>
+      <w:numFmt w:val="bullet"/>
+      <w:lvlText w:val=""/>
+      <w:lvlJc w:val="left"/>
+      <w:pPr>
+        <w:tabs>
+          <w:tab w:val="num" w:pos="2127"/>
+        </w:tabs>
+        <w:ind w:left="2127" w:hanging="283"/>
+      </w:pPr>
+      <w:rPr>
+        <w:rFonts w:ascii="Symbol" w:hAnsi="Symbol" w:cs="Symbol" w:hint="default"/>
+      </w:rPr>
+    </w:lvl>
+    <w:lvl w:ilvl="3">
+      <w:start w:val="1"/>
+      <w:numFmt w:val="bullet"/>
+      <w:lvlText w:val=""/>
+      <w:lvlJc w:val="left"/>
+      <w:pPr>
+        <w:tabs>
+          <w:tab w:val="num" w:pos="2836"/>
+        </w:tabs>
+        <w:ind w:left="2836" w:hanging="283"/>
+      </w:pPr>
+      <w:rPr>
+        <w:rFonts w:ascii="Symbol" w:hAnsi="Symbol" w:cs="Symbol" w:hint="default"/>
+      </w:rPr>
+    </w:lvl>
+    <w:lvl w:ilvl="4">
+      <w:start w:val="1"/>
+      <w:numFmt w:val="bullet"/>
+      <w:lvlText w:val=""/>
+      <w:lvlJc w:val="left"/>
+      <w:pPr>
+        <w:tabs>
+          <w:tab w:val="num" w:pos="3545"/>
+        </w:tabs>
+        <w:ind w:left="3545" w:hanging="283"/>
+      </w:pPr>
+      <w:rPr>
+        <w:rFonts w:ascii="Symbol" w:hAnsi="Symbol" w:cs="Symbol" w:hint="default"/>
+      </w:rPr>
+    </w:lvl>
+    <w:lvl w:ilvl="5">
+      <w:start w:val="1"/>
+      <w:numFmt w:val="bullet"/>
+      <w:lvlText w:val=""/>
+      <w:lvlJc w:val="left"/>
+      <w:pPr>
+        <w:tabs>
+          <w:tab w:val="num" w:pos="4254"/>
+        </w:tabs>
+        <w:ind w:left="4254" w:hanging="283"/>
+      </w:pPr>
+      <w:rPr>
+        <w:rFonts w:ascii="Symbol" w:hAnsi="Symbol" w:cs="Symbol" w:hint="default"/>
+      </w:rPr>
+    </w:lvl>
+    <w:lvl w:ilvl="6">
+      <w:start w:val="1"/>
+      <w:numFmt w:val="bullet"/>
+      <w:lvlText w:val=""/>
+      <w:lvlJc w:val="left"/>
+      <w:pPr>
+        <w:tabs>
+          <w:tab w:val="num" w:pos="4963"/>
+        </w:tabs>
+        <w:ind w:left="4963" w:hanging="283"/>
+      </w:pPr>
+      <w:rPr>
+        <w:rFonts w:ascii="Symbol" w:hAnsi="Symbol" w:cs="Symbol" w:hint="default"/>
+      </w:rPr>
+    </w:lvl>
+    <w:lvl w:ilvl="7">
+      <w:start w:val="1"/>
+      <w:numFmt w:val="bullet"/>
+      <w:lvlText w:val=""/>
+      <w:lvlJc w:val="left"/>
+      <w:pPr>
+        <w:tabs>
+          <w:tab w:val="num" w:pos="5672"/>
+        </w:tabs>
+        <w:ind w:left="5672" w:hanging="283"/>
+      </w:pPr>
+      <w:rPr>
+        <w:rFonts w:ascii="Symbol" w:hAnsi="Symbol" w:cs="Symbol" w:hint="default"/>
+      </w:rPr>
+    </w:lvl>
+    <w:lvl w:ilvl="8">
+      <w:start w:val="1"/>
+      <w:numFmt w:val="bullet"/>
+      <w:lvlText w:val=""/>
+      <w:lvlJc w:val="left"/>
+      <w:pPr>
+        <w:tabs>
+          <w:tab w:val="num" w:pos="6381"/>
+        </w:tabs>
+        <w:ind w:left="6381" w:hanging="283"/>
+      </w:pPr>
+      <w:rPr>
+        <w:rFonts w:ascii="Symbol" w:hAnsi="Symbol" w:cs="Symbol" w:hint="default"/>
+      </w:rPr>
+    </w:lvl>
+  </w:abstractNum>
+  <w:abstractNum w:abstractNumId="10">
     <w:lvl w:ilvl="0">
       <w:start w:val="1"/>
       <w:numFmt w:val="decimal"/>
@@ -3708,6 +4257,159 @@
   </w:num>
   <w:num w:numId="8">
     <w:abstractNumId w:val="8"/>
+  </w:num>
+  <w:num w:numId="9">
+    <w:abstractNumId w:val="9"/>
+  </w:num>
+  <w:num w:numId="10">
+    <w:abstractNumId w:val="10"/>
+  </w:num>
+  <w:num w:numId="11">
+    <w:abstractNumId w:val="7"/>
+    <w:lvlOverride w:ilvl="0"/>
+    <w:lvlOverride w:ilvl="1">
+      <w:lvl w:ilvl="1">
+        <w:start w:val="1"/>
+        <w:numFmt w:val="bullet"/>
+        <w:lvlText w:val=""/>
+        <w:lvlJc w:val="left"/>
+        <w:pPr>
+          <w:tabs>
+            <w:tab w:val="num" w:pos="1418"/>
+          </w:tabs>
+          <w:ind w:left="1418" w:hanging="283"/>
+        </w:pPr>
+        <w:rPr>
+          <w:rFonts w:ascii="Symbol" w:hAnsi="Symbol" w:cs="Symbol" w:hint="default"/>
+        </w:rPr>
+      </w:lvl>
+    </w:lvlOverride>
+    <w:lvlOverride w:ilvl="1"/>
+    <w:lvlOverride w:ilvl="2">
+      <w:lvl w:ilvl="2">
+        <w:start w:val="1"/>
+        <w:numFmt w:val="bullet"/>
+        <w:lvlText w:val=""/>
+        <w:lvlJc w:val="left"/>
+        <w:pPr>
+          <w:tabs>
+            <w:tab w:val="num" w:pos="2127"/>
+          </w:tabs>
+          <w:ind w:left="2127" w:hanging="283"/>
+        </w:pPr>
+        <w:rPr>
+          <w:rFonts w:ascii="Symbol" w:hAnsi="Symbol" w:cs="Symbol" w:hint="default"/>
+        </w:rPr>
+      </w:lvl>
+    </w:lvlOverride>
+    <w:lvlOverride w:ilvl="2"/>
+    <w:lvlOverride w:ilvl="3">
+      <w:lvl w:ilvl="3">
+        <w:start w:val="1"/>
+        <w:numFmt w:val="bullet"/>
+        <w:lvlText w:val=""/>
+        <w:lvlJc w:val="left"/>
+        <w:pPr>
+          <w:tabs>
+            <w:tab w:val="num" w:pos="2836"/>
+          </w:tabs>
+          <w:ind w:left="2836" w:hanging="283"/>
+        </w:pPr>
+        <w:rPr>
+          <w:rFonts w:ascii="Symbol" w:hAnsi="Symbol" w:cs="Symbol" w:hint="default"/>
+        </w:rPr>
+      </w:lvl>
+    </w:lvlOverride>
+    <w:lvlOverride w:ilvl="3"/>
+    <w:lvlOverride w:ilvl="4">
+      <w:lvl w:ilvl="4">
+        <w:start w:val="1"/>
+        <w:numFmt w:val="bullet"/>
+        <w:lvlText w:val=""/>
+        <w:lvlJc w:val="left"/>
+        <w:pPr>
+          <w:tabs>
+            <w:tab w:val="num" w:pos="3545"/>
+          </w:tabs>
+          <w:ind w:left="3545" w:hanging="283"/>
+        </w:pPr>
+        <w:rPr>
+          <w:rFonts w:ascii="Symbol" w:hAnsi="Symbol" w:cs="Symbol" w:hint="default"/>
+        </w:rPr>
+      </w:lvl>
+    </w:lvlOverride>
+    <w:lvlOverride w:ilvl="4"/>
+    <w:lvlOverride w:ilvl="5">
+      <w:lvl w:ilvl="5">
+        <w:start w:val="1"/>
+        <w:numFmt w:val="bullet"/>
+        <w:lvlText w:val=""/>
+        <w:lvlJc w:val="left"/>
+        <w:pPr>
+          <w:tabs>
+            <w:tab w:val="num" w:pos="4254"/>
+          </w:tabs>
+          <w:ind w:left="4254" w:hanging="283"/>
+        </w:pPr>
+        <w:rPr>
+          <w:rFonts w:ascii="Symbol" w:hAnsi="Symbol" w:cs="Symbol" w:hint="default"/>
+        </w:rPr>
+      </w:lvl>
+    </w:lvlOverride>
+    <w:lvlOverride w:ilvl="5"/>
+    <w:lvlOverride w:ilvl="6">
+      <w:lvl w:ilvl="6">
+        <w:start w:val="1"/>
+        <w:numFmt w:val="bullet"/>
+        <w:lvlText w:val=""/>
+        <w:lvlJc w:val="left"/>
+        <w:pPr>
+          <w:tabs>
+            <w:tab w:val="num" w:pos="4963"/>
+          </w:tabs>
+          <w:ind w:left="4963" w:hanging="283"/>
+        </w:pPr>
+        <w:rPr>
+          <w:rFonts w:ascii="Symbol" w:hAnsi="Symbol" w:cs="Symbol" w:hint="default"/>
+        </w:rPr>
+      </w:lvl>
+    </w:lvlOverride>
+    <w:lvlOverride w:ilvl="6"/>
+    <w:lvlOverride w:ilvl="7">
+      <w:lvl w:ilvl="7">
+        <w:start w:val="1"/>
+        <w:numFmt w:val="bullet"/>
+        <w:lvlText w:val=""/>
+        <w:lvlJc w:val="left"/>
+        <w:pPr>
+          <w:tabs>
+            <w:tab w:val="num" w:pos="5672"/>
+          </w:tabs>
+          <w:ind w:left="5672" w:hanging="283"/>
+        </w:pPr>
+        <w:rPr>
+          <w:rFonts w:ascii="Symbol" w:hAnsi="Symbol" w:cs="Symbol" w:hint="default"/>
+        </w:rPr>
+      </w:lvl>
+    </w:lvlOverride>
+    <w:lvlOverride w:ilvl="7"/>
+    <w:lvlOverride w:ilvl="8">
+      <w:lvl w:ilvl="8">
+        <w:start w:val="1"/>
+        <w:numFmt w:val="bullet"/>
+        <w:lvlText w:val=""/>
+        <w:lvlJc w:val="left"/>
+        <w:pPr>
+          <w:tabs>
+            <w:tab w:val="num" w:pos="6381"/>
+          </w:tabs>
+          <w:ind w:left="6381" w:hanging="283"/>
+        </w:pPr>
+        <w:rPr>
+          <w:rFonts w:ascii="Symbol" w:hAnsi="Symbol" w:cs="Symbol" w:hint="default"/>
+        </w:rPr>
+      </w:lvl>
+    </w:lvlOverride>
   </w:num>
 </w:numbering>
 </file>

</xml_diff>